<commit_message>
Redesign CIRUS Origin: restrained white/grey look, subtle motion
Website (8 pages CZ/EN) and calculator restyled with Geist (self-hosted),
navy accent and a thin 35 % threshold line; stamp and amber removed.
Smooth scroll reveal, animated Commission example, sticky header, FAQ
accordion, reduced-motion and no-JS fallbacks. Applied buyer and
designer critique: precise headline, category table with in-house row,
neutral pills for excluded rows, auditable printed report, CSP and
SHA-256 for the offline file, sources on every figure, About us
section, launch discount removed from the web. Templates regenerated
in the new palette. Tests 150/150, e2e 61/61.

Co-Authored-By: Claude Opus 5.5 <noreply@anthropic.com>
Claude-Session: https://claude.ai/code/session_01LYDKt7SjbfbQtzd7dPL3NQ
</commit_message>
<xml_diff>
--- a/site/sablony/prohlaseni-o-puvodu-cs.docx
+++ b/site/sablony/prohlaseni-o-puvodu-cs.docx
@@ -9,7 +9,7 @@
       <w:r>
         <w:rPr>
           <w:b/>
-          <w:color w:val="C97A00"/>
+          <w:color w:val="0F3D73"/>
           <w:sz w:val="17"/>
         </w:rPr>
         <w:t>VZOR</w:t>
@@ -52,7 +52,7 @@
         <w:tc>
           <w:tcPr>
             <w:tcW w:type="dxa" w:w="2041"/>
-            <w:shd w:val="clear" w:color="auto" w:fill="E7E9E3"/>
+            <w:shd w:val="clear" w:color="auto" w:fill="F4F5F7"/>
           </w:tcPr>
           <w:p>
             <w:pPr>
@@ -70,7 +70,7 @@
         <w:tc>
           <w:tcPr>
             <w:tcW w:type="dxa" w:w="3798"/>
-            <w:shd w:val="clear" w:color="auto" w:fill="E7E9E3"/>
+            <w:shd w:val="clear" w:color="auto" w:fill="F4F5F7"/>
           </w:tcPr>
           <w:p>
             <w:pPr>
@@ -89,7 +89,7 @@
         <w:tc>
           <w:tcPr>
             <w:tcW w:type="dxa" w:w="3798"/>
-            <w:shd w:val="clear" w:color="auto" w:fill="E7E9E3"/>
+            <w:shd w:val="clear" w:color="auto" w:fill="F4F5F7"/>
           </w:tcPr>
           <w:p>
             <w:pPr>
@@ -122,7 +122,7 @@
             <w:r>
               <w:rPr>
                 <w:b w:val="0"/>
-                <w:color w:val="56636D"/>
+                <w:color w:val="5B6472"/>
                 <w:sz w:val="18"/>
               </w:rPr>
               <w:t>Obchodní jméno</w:t>
@@ -158,7 +158,7 @@
             <w:r>
               <w:rPr>
                 <w:b w:val="0"/>
-                <w:color w:val="56636D"/>
+                <w:color w:val="5B6472"/>
                 <w:sz w:val="18"/>
               </w:rPr>
               <w:t>Sídlo</w:t>
@@ -194,7 +194,7 @@
             <w:r>
               <w:rPr>
                 <w:b w:val="0"/>
-                <w:color w:val="56636D"/>
+                <w:color w:val="5B6472"/>
                 <w:sz w:val="18"/>
               </w:rPr>
               <w:t>IČO / DIČ</w:t>
@@ -230,7 +230,7 @@
             <w:r>
               <w:rPr>
                 <w:b w:val="0"/>
-                <w:color w:val="56636D"/>
+                <w:color w:val="5B6472"/>
                 <w:sz w:val="18"/>
               </w:rPr>
               <w:t>Kontaktní osoba</w:t>
@@ -295,7 +295,7 @@
         <w:tc>
           <w:tcPr>
             <w:tcW w:type="dxa" w:w="567"/>
-            <w:shd w:val="clear" w:color="auto" w:fill="E7E9E3"/>
+            <w:shd w:val="clear" w:color="auto" w:fill="F4F5F7"/>
           </w:tcPr>
           <w:p>
             <w:pPr>
@@ -314,7 +314,7 @@
         <w:tc>
           <w:tcPr>
             <w:tcW w:type="dxa" w:w="1928"/>
-            <w:shd w:val="clear" w:color="auto" w:fill="E7E9E3"/>
+            <w:shd w:val="clear" w:color="auto" w:fill="F4F5F7"/>
           </w:tcPr>
           <w:p>
             <w:pPr>
@@ -333,7 +333,7 @@
         <w:tc>
           <w:tcPr>
             <w:tcW w:type="dxa" w:w="3061"/>
-            <w:shd w:val="clear" w:color="auto" w:fill="E7E9E3"/>
+            <w:shd w:val="clear" w:color="auto" w:fill="F4F5F7"/>
           </w:tcPr>
           <w:p>
             <w:pPr>
@@ -352,7 +352,7 @@
         <w:tc>
           <w:tcPr>
             <w:tcW w:type="dxa" w:w="1928"/>
-            <w:shd w:val="clear" w:color="auto" w:fill="E7E9E3"/>
+            <w:shd w:val="clear" w:color="auto" w:fill="F4F5F7"/>
           </w:tcPr>
           <w:p>
             <w:pPr>
@@ -368,7 +368,7 @@
             </w:r>
             <w:r>
               <w:rPr>
-                <w:color w:val="56636D"/>
+                <w:color w:val="5B6472"/>
                 <w:sz w:val="16"/>
               </w:rPr>
               <w:br/>
@@ -379,7 +379,7 @@
         <w:tc>
           <w:tcPr>
             <w:tcW w:type="dxa" w:w="2154"/>
-            <w:shd w:val="clear" w:color="auto" w:fill="E7E9E3"/>
+            <w:shd w:val="clear" w:color="auto" w:fill="F4F5F7"/>
           </w:tcPr>
           <w:p>
             <w:pPr>
@@ -395,7 +395,7 @@
             </w:r>
             <w:r>
               <w:rPr>
-                <w:color w:val="56636D"/>
+                <w:color w:val="5B6472"/>
                 <w:sz w:val="16"/>
               </w:rPr>
               <w:br/>
@@ -421,7 +421,7 @@
             <w:r>
               <w:rPr>
                 <w:b w:val="0"/>
-                <w:color w:val="56636D"/>
+                <w:color w:val="5B6472"/>
                 <w:sz w:val="18"/>
               </w:rPr>
               <w:t>1</w:t>
@@ -470,7 +470,7 @@
             <w:r>
               <w:rPr>
                 <w:b w:val="0"/>
-                <w:color w:val="56636D"/>
+                <w:color w:val="5B6472"/>
                 <w:sz w:val="18"/>
               </w:rPr>
               <w:t>2</w:t>
@@ -519,7 +519,7 @@
             <w:r>
               <w:rPr>
                 <w:b w:val="0"/>
-                <w:color w:val="56636D"/>
+                <w:color w:val="5B6472"/>
                 <w:sz w:val="18"/>
               </w:rPr>
               <w:t>3</w:t>
@@ -568,7 +568,7 @@
             <w:r>
               <w:rPr>
                 <w:b w:val="0"/>
-                <w:color w:val="56636D"/>
+                <w:color w:val="5B6472"/>
                 <w:sz w:val="18"/>
               </w:rPr>
               <w:t>4</w:t>
@@ -617,7 +617,7 @@
             <w:r>
               <w:rPr>
                 <w:b w:val="0"/>
-                <w:color w:val="56636D"/>
+                <w:color w:val="5B6472"/>
                 <w:sz w:val="18"/>
               </w:rPr>
               <w:t>5</w:t>
@@ -666,7 +666,7 @@
             <w:r>
               <w:rPr>
                 <w:b w:val="0"/>
-                <w:color w:val="56636D"/>
+                <w:color w:val="5B6472"/>
                 <w:sz w:val="18"/>
               </w:rPr>
               <w:t>6</w:t>
@@ -715,7 +715,7 @@
             <w:r>
               <w:rPr>
                 <w:b w:val="0"/>
-                <w:color w:val="56636D"/>
+                <w:color w:val="5B6472"/>
                 <w:sz w:val="18"/>
               </w:rPr>
               <w:t>7</w:t>
@@ -764,7 +764,7 @@
             <w:r>
               <w:rPr>
                 <w:b w:val="0"/>
-                <w:color w:val="56636D"/>
+                <w:color w:val="5B6472"/>
                 <w:sz w:val="18"/>
               </w:rPr>
               <w:t>8</w:t>
@@ -813,7 +813,7 @@
             <w:r>
               <w:rPr>
                 <w:b w:val="0"/>
-                <w:color w:val="56636D"/>
+                <w:color w:val="5B6472"/>
                 <w:sz w:val="18"/>
               </w:rPr>
               <w:t>9</w:t>
@@ -862,7 +862,7 @@
             <w:r>
               <w:rPr>
                 <w:b w:val="0"/>
-                <w:color w:val="56636D"/>
+                <w:color w:val="5B6472"/>
                 <w:sz w:val="18"/>
               </w:rPr>
               <w:t>10</w:t>
@@ -949,7 +949,7 @@
       </w:r>
       <w:r>
         <w:rPr>
-          <w:color w:val="56636D"/>
+          <w:color w:val="5B6472"/>
           <w:sz w:val="18"/>
         </w:rPr>
         <w:t>(nejdéle 24 měsíců ode dne podpisu)</w:t>
@@ -994,7 +994,7 @@
         <w:tc>
           <w:tcPr>
             <w:tcW w:type="dxa" w:w="1871"/>
-            <w:shd w:val="clear" w:color="auto" w:fill="E7E9E3"/>
+            <w:shd w:val="clear" w:color="auto" w:fill="F4F5F7"/>
           </w:tcPr>
           <w:p>
             <w:pPr>
@@ -1004,7 +1004,7 @@
             <w:r>
               <w:rPr>
                 <w:b w:val="0"/>
-                <w:color w:val="56636D"/>
+                <w:color w:val="5B6472"/>
                 <w:sz w:val="18"/>
               </w:rPr>
               <w:t>Místo</w:t>
@@ -1014,7 +1014,7 @@
         <w:tc>
           <w:tcPr>
             <w:tcW w:type="dxa" w:w="1474"/>
-            <w:shd w:val="clear" w:color="auto" w:fill="E7E9E3"/>
+            <w:shd w:val="clear" w:color="auto" w:fill="F4F5F7"/>
           </w:tcPr>
           <w:p>
             <w:pPr>
@@ -1024,7 +1024,7 @@
             <w:r>
               <w:rPr>
                 <w:b w:val="0"/>
-                <w:color w:val="56636D"/>
+                <w:color w:val="5B6472"/>
                 <w:sz w:val="18"/>
               </w:rPr>
               <w:t>Datum</w:t>
@@ -1034,7 +1034,7 @@
         <w:tc>
           <w:tcPr>
             <w:tcW w:type="dxa" w:w="2324"/>
-            <w:shd w:val="clear" w:color="auto" w:fill="E7E9E3"/>
+            <w:shd w:val="clear" w:color="auto" w:fill="F4F5F7"/>
           </w:tcPr>
           <w:p>
             <w:pPr>
@@ -1044,7 +1044,7 @@
             <w:r>
               <w:rPr>
                 <w:b w:val="0"/>
-                <w:color w:val="56636D"/>
+                <w:color w:val="5B6472"/>
                 <w:sz w:val="18"/>
               </w:rPr>
               <w:t>Jméno a funkce</w:t>
@@ -1054,7 +1054,7 @@
         <w:tc>
           <w:tcPr>
             <w:tcW w:type="dxa" w:w="1928"/>
-            <w:shd w:val="clear" w:color="auto" w:fill="E7E9E3"/>
+            <w:shd w:val="clear" w:color="auto" w:fill="F4F5F7"/>
           </w:tcPr>
           <w:p>
             <w:pPr>
@@ -1064,7 +1064,7 @@
             <w:r>
               <w:rPr>
                 <w:b w:val="0"/>
-                <w:color w:val="56636D"/>
+                <w:color w:val="5B6472"/>
                 <w:sz w:val="18"/>
               </w:rPr>
               <w:t>Podpis</w:t>
@@ -1074,7 +1074,7 @@
         <w:tc>
           <w:tcPr>
             <w:tcW w:type="dxa" w:w="2041"/>
-            <w:shd w:val="clear" w:color="auto" w:fill="FBEFD9"/>
+            <w:shd w:val="clear" w:color="auto" w:fill="EEF0F3"/>
           </w:tcPr>
           <w:p>
             <w:pPr>
@@ -1084,7 +1084,7 @@
             <w:r>
               <w:rPr>
                 <w:b w:val="0"/>
-                <w:color w:val="C97A00"/>
+                <w:color w:val="0F3D73"/>
                 <w:sz w:val="18"/>
               </w:rPr>
               <w:t>Razítko</w:t>
@@ -1149,14 +1149,14 @@
     <w:r/>
     <w:r>
       <w:rPr>
-        <w:color w:val="56636D"/>
+        <w:color w:val="5B6472"/>
         <w:sz w:val="16"/>
       </w:rPr>
       <w:t>Vzor. Nejde o preferenční prohlášení podle prováděcího nařízení (EU) 2015/2447.</w:t>
     </w:r>
     <w:r>
       <w:rPr>
-        <w:color w:val="56636D"/>
+        <w:color w:val="5B6472"/>
         <w:sz w:val="16"/>
       </w:rPr>
       <w:t xml:space="preserve">  ·  CIRUS Origin, cirusorigin.cz</w:t>
@@ -1533,7 +1533,7 @@
     </w:pPr>
     <w:rPr>
       <w:rFonts w:ascii="Arial" w:hAnsi="Arial" w:eastAsia="Arial"/>
-      <w:color w:val="142029"/>
+      <w:color w:val="0B1220"/>
       <w:sz w:val="20"/>
       <w:lang w:val="cs-CZ" w:eastAsia="cs-CZ"/>
     </w:rPr>

</xml_diff>